<commit_message>
feat: add petugas to general arsip form
</commit_message>
<xml_diff>
--- a/public/templates/template-perizinan.docx
+++ b/public/templates/template-perizinan.docx
@@ -962,204 +962,6 @@
         </w:rPr>
       </w:pPr>
     </w:p>
-    <w:p>
-      <w:pPr>
-        <w:spacing w:after="0" w:line="360" w:lineRule="auto"/>
-        <w:ind w:firstLine="720"/>
-        <w:jc w:val="both"/>
-        <w:rPr>
-          <w:rFonts w:ascii="Arial" w:hAnsi="Arial" w:cs="Arial"/>
-          <w:sz w:val="24"/>
-          <w:szCs w:val="24"/>
-        </w:rPr>
-      </w:pPr>
-      <w:r>
-        <w:rPr>
-          <w:rFonts w:ascii="Arial" w:hAnsi="Arial" w:cs="Arial"/>
-          <w:sz w:val="24"/>
-          <w:szCs w:val="24"/>
-        </w:rPr>
-        <w:t xml:space="preserve">Dengan hormat, bersama ini kami laporkan hasil </w:t>
-      </w:r>
-      <w:r>
-        <w:rPr>
-          <w:rFonts w:ascii="Arial" w:hAnsi="Arial" w:cs="Arial"/>
-          <w:sz w:val="24"/>
-          <w:szCs w:val="24"/>
-        </w:rPr>
-        <w:t>proses Perizinan yang diterbitkan sebagai berikut</w:t>
-      </w:r>
-    </w:p>
-    <w:p>
-      <w:pPr>
-        <w:pStyle w:val="ListParagraph"/>
-        <w:spacing w:after="0" w:line="360" w:lineRule="auto"/>
-        <w:ind w:left="567"/>
-        <w:jc w:val="both"/>
-        <w:rPr>
-          <w:rFonts w:ascii="Arial" w:hAnsi="Arial" w:cs="Arial"/>
-          <w:sz w:val="24"/>
-          <w:szCs w:val="24"/>
-        </w:rPr>
-      </w:pPr>
-    </w:p>
-    <w:tbl>
-      <w:tblPr>
-        <w:tblStyle w:val="TableGrid"/>
-        <w:tblW w:w="0" w:type="auto"/>
-        <w:tblBorders>
-          <w:top w:val="none" w:sz="0" w:space="0" w:color="auto"/>
-          <w:left w:val="none" w:sz="0" w:space="0" w:color="auto"/>
-          <w:bottom w:val="none" w:sz="0" w:space="0" w:color="auto"/>
-          <w:right w:val="none" w:sz="0" w:space="0" w:color="auto"/>
-          <w:insideH w:val="none" w:sz="0" w:space="0" w:color="auto"/>
-          <w:insideV w:val="none" w:sz="0" w:space="0" w:color="auto"/>
-        </w:tblBorders>
-        <w:tblLook w:val="04A0" w:firstRow="1" w:lastRow="0" w:firstColumn="1" w:lastColumn="0" w:noHBand="0" w:noVBand="1"/>
-      </w:tblPr>
-      <w:tblGrid>
-        <w:gridCol w:w="4815"/>
-        <w:gridCol w:w="2982"/>
-        <w:gridCol w:w="1553"/>
-      </w:tblGrid>
-      <w:tr>
-        <w:tc>
-          <w:tcPr>
-            <w:tcW w:w="4815" w:type="dxa"/>
-          </w:tcPr>
-          <w:p>
-            <w:pPr>
-              <w:spacing w:line="360" w:lineRule="auto"/>
-              <w:jc w:val="both"/>
-              <w:rPr>
-                <w:rFonts w:ascii="Arial" w:hAnsi="Arial" w:cs="Arial"/>
-                <w:sz w:val="24"/>
-                <w:szCs w:val="24"/>
-              </w:rPr>
-            </w:pPr>
-          </w:p>
-        </w:tc>
-        <w:tc>
-          <w:tcPr>
-            <w:tcW w:w="4535" w:type="dxa"/>
-            <w:gridSpan w:val="2"/>
-          </w:tcPr>
-          <w:p>
-            <w:pPr>
-              <w:spacing w:line="360" w:lineRule="auto"/>
-              <w:jc w:val="both"/>
-              <w:rPr>
-                <w:rFonts w:ascii="Arial" w:hAnsi="Arial" w:cs="Arial"/>
-                <w:sz w:val="24"/>
-                <w:szCs w:val="24"/>
-              </w:rPr>
-            </w:pPr>
-            <w:r>
-              <w:rPr>
-                <w:rFonts w:ascii="Arial" w:hAnsi="Arial" w:cs="Arial"/>
-                <w:sz w:val="24"/>
-                <w:szCs w:val="24"/>
-              </w:rPr>
-              <w:t>Yang Melaksanakan Tugas</w:t>
-            </w:r>
-          </w:p>
-        </w:tc>
-      </w:tr>
-      <w:tr>
-        <w:tc>
-          <w:tcPr>
-            <w:tcW w:w="4815" w:type="dxa"/>
-          </w:tcPr>
-          <w:p>
-            <w:pPr>
-              <w:spacing w:line="360" w:lineRule="auto"/>
-              <w:jc w:val="both"/>
-              <w:rPr>
-                <w:rFonts w:ascii="Arial" w:hAnsi="Arial" w:cs="Arial"/>
-                <w:sz w:val="24"/>
-                <w:szCs w:val="24"/>
-              </w:rPr>
-            </w:pPr>
-          </w:p>
-        </w:tc>
-        <w:tc>
-          <w:tcPr>
-            <w:tcW w:w="2982" w:type="dxa"/>
-          </w:tcPr>
-          <w:p>
-            <w:pPr>
-              <w:spacing w:line="360" w:lineRule="auto"/>
-              <w:rPr>
-                <w:rFonts w:ascii="Arial" w:hAnsi="Arial" w:cs="Arial"/>
-                <w:sz w:val="24"/>
-                <w:szCs w:val="24"/>
-              </w:rPr>
-            </w:pPr>
-            <w:r>
-              <w:rPr>
-                <w:rFonts w:ascii="Arial" w:hAnsi="Arial" w:cs="Arial"/>
-                <w:sz w:val="24"/>
-                <w:szCs w:val="24"/>
-              </w:rPr>
-              <w:t>{#petugas}</w:t>
-            </w:r>
-          </w:p>
-          <w:p>
-            <w:pPr>
-              <w:spacing w:line="360" w:lineRule="auto"/>
-              <w:rPr>
-                <w:rFonts w:ascii="Arial" w:hAnsi="Arial" w:cs="Arial"/>
-                <w:sz w:val="24"/>
-                <w:szCs w:val="24"/>
-              </w:rPr>
-            </w:pPr>
-            <w:r>
-              <w:rPr>
-                <w:rFonts w:ascii="Arial" w:hAnsi="Arial" w:cs="Arial"/>
-                <w:sz w:val="24"/>
-                <w:szCs w:val="24"/>
-              </w:rPr>
-              <w:t>{nomor}. {nama} {/petugas}</w:t>
-            </w:r>
-          </w:p>
-          <w:p>
-            <w:pPr>
-              <w:spacing w:line="360" w:lineRule="auto"/>
-              <w:jc w:val="both"/>
-              <w:rPr>
-                <w:rFonts w:ascii="Arial" w:hAnsi="Arial" w:cs="Arial"/>
-                <w:sz w:val="24"/>
-                <w:szCs w:val="24"/>
-              </w:rPr>
-            </w:pPr>
-          </w:p>
-        </w:tc>
-        <w:tc>
-          <w:tcPr>
-            <w:tcW w:w="1553" w:type="dxa"/>
-          </w:tcPr>
-          <w:p>
-            <w:pPr>
-              <w:spacing w:line="360" w:lineRule="auto"/>
-              <w:jc w:val="both"/>
-              <w:rPr>
-                <w:rFonts w:ascii="Arial" w:hAnsi="Arial" w:cs="Arial"/>
-                <w:sz w:val="24"/>
-                <w:szCs w:val="24"/>
-              </w:rPr>
-            </w:pPr>
-            <w:r>
-              <w:rPr>
-                <w:rFonts w:ascii="Arial" w:hAnsi="Arial" w:cs="Arial"/>
-                <w:sz w:val="24"/>
-                <w:szCs w:val="24"/>
-              </w:rPr>
-              <w:t>....................</w:t>
-            </w:r>
-          </w:p>
-        </w:tc>
-      </w:tr>
-    </w:tbl>
     <w:p>
       <w:pPr>
         <w:spacing w:after="0" w:line="360" w:lineRule="auto"/>

</xml_diff>

<commit_message>
chore: Update docx templates
</commit_message>
<xml_diff>
--- a/public/templates/template-perizinan.docx
+++ b/public/templates/template-perizinan.docx
@@ -983,188 +983,6 @@
           <w:szCs w:val="24"/>
         </w:rPr>
       </w:pPr>
-      <w:r>
-        <w:rPr>
-          <w:rFonts w:ascii="Arial" w:hAnsi="Arial" w:cs="Arial"/>
-          <w:b/>
-          <w:bCs/>
-          <w:sz w:val="24"/>
-          <w:szCs w:val="24"/>
-        </w:rPr>
-        <w:br w:type="page"/>
-      </w:r>
-    </w:p>
-    <w:p>
-      <w:pPr>
-        <w:spacing w:after="0" w:line="360" w:lineRule="auto"/>
-        <w:jc w:val="center"/>
-        <w:rPr>
-          <w:rFonts w:ascii="Arial" w:hAnsi="Arial" w:cs="Arial"/>
-          <w:b/>
-          <w:bCs/>
-          <w:sz w:val="24"/>
-          <w:szCs w:val="24"/>
-        </w:rPr>
-      </w:pPr>
-      <w:r>
-        <w:rPr>
-          <w:rFonts w:ascii="Arial" w:hAnsi="Arial" w:cs="Arial"/>
-          <w:b/>
-          <w:bCs/>
-          <w:sz w:val="24"/>
-          <w:szCs w:val="24"/>
-        </w:rPr>
-        <w:lastRenderedPageBreak/>
-        <w:t>LAMPIRAN</w:t>
-      </w:r>
-      <w:r>
-        <w:rPr>
-          <w:rFonts w:ascii="Arial" w:hAnsi="Arial" w:cs="Arial"/>
-          <w:b/>
-          <w:bCs/>
-          <w:sz w:val="24"/>
-          <w:szCs w:val="24"/>
-        </w:rPr>
-        <w:t xml:space="preserve"> DOKUMENTASI</w:t>
-      </w:r>
-    </w:p>
-    <w:p>
-      <w:pPr>
-        <w:spacing w:after="0" w:line="360" w:lineRule="auto"/>
-        <w:jc w:val="center"/>
-        <w:rPr>
-          <w:rFonts w:ascii="Arial" w:hAnsi="Arial" w:cs="Arial"/>
-          <w:b/>
-          <w:bCs/>
-          <w:sz w:val="24"/>
-          <w:szCs w:val="24"/>
-        </w:rPr>
-      </w:pPr>
-    </w:p>
-    <w:p>
-      <w:pPr>
-        <w:spacing w:after="0" w:line="360" w:lineRule="auto"/>
-        <w:jc w:val="center"/>
-        <w:rPr>
-          <w:rFonts w:ascii="Arial" w:hAnsi="Arial" w:cs="Arial"/>
-          <w:sz w:val="24"/>
-          <w:szCs w:val="24"/>
-        </w:rPr>
-      </w:pPr>
-      <w:r>
-        <w:rPr>
-          <w:rFonts w:ascii="Arial" w:hAnsi="Arial" w:cs="Arial"/>
-          <w:sz w:val="24"/>
-          <w:szCs w:val="24"/>
-        </w:rPr>
-        <w:t>{#fotos}</w:t>
-      </w:r>
-    </w:p>
-    <w:p>
-      <w:pPr>
-        <w:spacing w:after="0" w:line="360" w:lineRule="auto"/>
-        <w:jc w:val="center"/>
-        <w:rPr>
-          <w:rFonts w:ascii="Arial" w:hAnsi="Arial" w:cs="Arial"/>
-          <w:sz w:val="24"/>
-          <w:szCs w:val="24"/>
-        </w:rPr>
-      </w:pPr>
-      <w:r>
-        <w:rPr>
-          <w:rFonts w:ascii="Arial" w:hAnsi="Arial" w:cs="Arial"/>
-          <w:sz w:val="24"/>
-          <w:szCs w:val="24"/>
-        </w:rPr>
-        <w:t>{%</w:t>
-      </w:r>
-      <w:proofErr w:type="spellStart"/>
-      <w:r>
-        <w:rPr>
-          <w:rFonts w:ascii="Arial" w:hAnsi="Arial" w:cs="Arial"/>
-          <w:sz w:val="24"/>
-          <w:szCs w:val="24"/>
-        </w:rPr>
-        <w:t>url</w:t>
-      </w:r>
-      <w:proofErr w:type="spellEnd"/>
-      <w:r>
-        <w:rPr>
-          <w:rFonts w:ascii="Arial" w:hAnsi="Arial" w:cs="Arial"/>
-          <w:sz w:val="24"/>
-          <w:szCs w:val="24"/>
-        </w:rPr>
-        <w:t>}</w:t>
-      </w:r>
-    </w:p>
-    <w:p>
-      <w:pPr>
-        <w:spacing w:after="0" w:line="360" w:lineRule="auto"/>
-        <w:jc w:val="center"/>
-        <w:rPr>
-          <w:rFonts w:ascii="Arial" w:hAnsi="Arial" w:cs="Arial"/>
-          <w:sz w:val="24"/>
-          <w:szCs w:val="24"/>
-        </w:rPr>
-      </w:pPr>
-      <w:r>
-        <w:rPr>
-          <w:rFonts w:ascii="Arial" w:hAnsi="Arial" w:cs="Arial"/>
-          <w:sz w:val="24"/>
-          <w:szCs w:val="24"/>
-        </w:rPr>
-        <w:t>{keterangan}</w:t>
-      </w:r>
-    </w:p>
-    <w:p>
-      <w:pPr>
-        <w:spacing w:after="0" w:line="360" w:lineRule="auto"/>
-        <w:jc w:val="center"/>
-        <w:rPr>
-          <w:rFonts w:ascii="Arial" w:hAnsi="Arial" w:cs="Arial"/>
-          <w:sz w:val="24"/>
-          <w:szCs w:val="24"/>
-        </w:rPr>
-      </w:pPr>
-    </w:p>
-    <w:p>
-      <w:pPr>
-        <w:spacing w:after="0" w:line="360" w:lineRule="auto"/>
-        <w:jc w:val="center"/>
-        <w:rPr>
-          <w:rFonts w:ascii="Arial" w:hAnsi="Arial" w:cs="Arial"/>
-          <w:b/>
-          <w:bCs/>
-          <w:sz w:val="24"/>
-          <w:szCs w:val="24"/>
-        </w:rPr>
-      </w:pPr>
-      <w:r>
-        <w:rPr>
-          <w:rFonts w:ascii="Arial" w:hAnsi="Arial" w:cs="Arial"/>
-          <w:sz w:val="24"/>
-          <w:szCs w:val="24"/>
-        </w:rPr>
-        <w:t>{/</w:t>
-      </w:r>
-      <w:proofErr w:type="spellStart"/>
-      <w:r>
-        <w:rPr>
-          <w:rFonts w:ascii="Arial" w:hAnsi="Arial" w:cs="Arial"/>
-          <w:sz w:val="24"/>
-          <w:szCs w:val="24"/>
-        </w:rPr>
-        <w:t>fotos</w:t>
-      </w:r>
-      <w:proofErr w:type="spellEnd"/>
-      <w:r>
-        <w:rPr>
-          <w:rFonts w:ascii="Arial" w:hAnsi="Arial" w:cs="Arial"/>
-          <w:sz w:val="24"/>
-          <w:szCs w:val="24"/>
-        </w:rPr>
-        <w:t>}</w:t>
-      </w:r>
     </w:p>
     <w:sectPr>
       <w:pgSz w:w="12240" w:h="15840"/>

</xml_diff>